<commit_message>
Add defect photo workflow and improve measurement exports
</commit_message>
<xml_diff>
--- a/revize-frontend/public/templates/elektro_rz_template.docx
+++ b/revize-frontend/public/templates/elektro_rz_template.docx
@@ -23,23 +23,7 @@
           <w:b/>
           <w:sz w:val="24"/>
         </w:rPr>
-        <w:t>--{{</w:t>
-      </w:r>
-      <w:proofErr w:type="spellStart"/>
-      <w:r>
-        <w:rPr>
-          <w:b/>
-          <w:sz w:val="24"/>
-        </w:rPr>
-        <w:t>typ_revize</w:t>
-      </w:r>
-      <w:proofErr w:type="spellEnd"/>
-      <w:r>
-        <w:rPr>
-          <w:b/>
-          <w:sz w:val="24"/>
-        </w:rPr>
-        <w:t>}}--</w:t>
+        <w:t>--{{typ_revize}}--</w:t>
       </w:r>
     </w:p>
     <w:p>
@@ -209,7 +193,6 @@
       </w:tr>
     </w:tbl>
     <w:p/>
-    <w:p/>
     <w:tbl>
       <w:tblPr>
         <w:tblW w:w="0" w:type="auto"/>
@@ -242,28 +225,12 @@
             <w:vAlign w:val="center"/>
           </w:tcPr>
           <w:p>
-            <w:proofErr w:type="spellStart"/>
             <w:r>
               <w:rPr>
                 <w:b/>
               </w:rPr>
-              <w:t>Revizní</w:t>
+              <w:t>Revizní technik</w:t>
             </w:r>
-            <w:proofErr w:type="spellEnd"/>
-            <w:r>
-              <w:rPr>
-                <w:b/>
-              </w:rPr>
-              <w:t xml:space="preserve"> </w:t>
-            </w:r>
-            <w:proofErr w:type="spellStart"/>
-            <w:r>
-              <w:rPr>
-                <w:b/>
-              </w:rPr>
-              <w:t>technik</w:t>
-            </w:r>
-            <w:proofErr w:type="spellEnd"/>
           </w:p>
         </w:tc>
         <w:tc>
@@ -289,14 +256,12 @@
             <w:vAlign w:val="center"/>
           </w:tcPr>
           <w:p>
-            <w:proofErr w:type="spellStart"/>
             <w:r>
               <w:rPr>
                 <w:b/>
               </w:rPr>
               <w:t>Firma</w:t>
             </w:r>
-            <w:proofErr w:type="spellEnd"/>
           </w:p>
         </w:tc>
         <w:tc>
@@ -324,14 +289,12 @@
             <w:vAlign w:val="center"/>
           </w:tcPr>
           <w:p>
-            <w:proofErr w:type="spellStart"/>
             <w:r>
               <w:rPr>
                 <w:b/>
               </w:rPr>
               <w:t>Osvědčení</w:t>
             </w:r>
-            <w:proofErr w:type="spellEnd"/>
           </w:p>
         </w:tc>
         <w:tc>
@@ -372,23 +335,7 @@
           </w:tcPr>
           <w:p>
             <w:r>
-              <w:t>{{</w:t>
-            </w:r>
-            <w:proofErr w:type="spellStart"/>
-            <w:r>
-              <w:t>technik_ico</w:t>
-            </w:r>
-            <w:proofErr w:type="spellEnd"/>
-            <w:r>
-              <w:t>}} / {{</w:t>
-            </w:r>
-            <w:proofErr w:type="spellStart"/>
-            <w:r>
-              <w:t>technik_dic</w:t>
-            </w:r>
-            <w:proofErr w:type="spellEnd"/>
-            <w:r>
-              <w:t>}}</w:t>
+              <w:t>{{technik_ico}} / {{technik_dic}}</w:t>
             </w:r>
           </w:p>
         </w:tc>
@@ -406,14 +353,12 @@
             <w:vAlign w:val="center"/>
           </w:tcPr>
           <w:p>
-            <w:proofErr w:type="spellStart"/>
             <w:r>
               <w:rPr>
                 <w:b/>
               </w:rPr>
               <w:t>Oprávnění</w:t>
             </w:r>
-            <w:proofErr w:type="spellEnd"/>
           </w:p>
         </w:tc>
         <w:tc>
@@ -439,14 +384,12 @@
             <w:vAlign w:val="center"/>
           </w:tcPr>
           <w:p>
-            <w:proofErr w:type="spellStart"/>
             <w:r>
               <w:rPr>
                 <w:b/>
               </w:rPr>
               <w:t>Adresa</w:t>
             </w:r>
-            <w:proofErr w:type="spellEnd"/>
           </w:p>
         </w:tc>
         <w:tc>
@@ -493,28 +436,12 @@
             <w:vAlign w:val="center"/>
           </w:tcPr>
           <w:p>
-            <w:proofErr w:type="spellStart"/>
             <w:r>
               <w:rPr>
                 <w:b/>
               </w:rPr>
-              <w:t>Adresa</w:t>
+              <w:t>Adresa stavby</w:t>
             </w:r>
-            <w:proofErr w:type="spellEnd"/>
-            <w:r>
-              <w:rPr>
-                <w:b/>
-              </w:rPr>
-              <w:t xml:space="preserve"> </w:t>
-            </w:r>
-            <w:proofErr w:type="spellStart"/>
-            <w:r>
-              <w:rPr>
-                <w:b/>
-              </w:rPr>
-              <w:t>stavby</w:t>
-            </w:r>
-            <w:proofErr w:type="spellEnd"/>
           </w:p>
         </w:tc>
         <w:tc>
@@ -616,35 +543,17 @@
     </w:tbl>
     <w:p/>
     <w:p>
-      <w:proofErr w:type="spellStart"/>
       <w:r>
         <w:rPr>
           <w:b/>
           <w:sz w:val="23"/>
         </w:rPr>
-        <w:t>Měřicí</w:t>
+        <w:t>Měřicí přístroje</w:t>
       </w:r>
-      <w:proofErr w:type="spellEnd"/>
-      <w:r>
-        <w:rPr>
-          <w:b/>
-          <w:sz w:val="23"/>
-        </w:rPr>
-        <w:t xml:space="preserve"> </w:t>
-      </w:r>
-      <w:proofErr w:type="spellStart"/>
-      <w:r>
-        <w:rPr>
-          <w:b/>
-          <w:sz w:val="23"/>
-        </w:rPr>
-        <w:t>přístroje</w:t>
-      </w:r>
-      <w:proofErr w:type="spellEnd"/>
     </w:p>
     <w:tbl>
       <w:tblPr>
-        <w:tblW w:w="5000" w:type="pct"/>
+        <w:tblW w:w="4883" w:type="pct"/>
         <w:tblBorders>
           <w:top w:val="nil"/>
           <w:left w:val="nil"/>
@@ -656,16 +565,16 @@
         <w:tblLook w:val="04A0" w:firstRow="1" w:lastRow="0" w:firstColumn="1" w:lastColumn="0" w:noHBand="0" w:noVBand="1"/>
       </w:tblPr>
       <w:tblGrid>
-        <w:gridCol w:w="2859"/>
+        <w:gridCol w:w="2860"/>
         <w:gridCol w:w="1131"/>
         <w:gridCol w:w="974"/>
         <w:gridCol w:w="1465"/>
-        <w:gridCol w:w="3871"/>
+        <w:gridCol w:w="3629"/>
       </w:tblGrid>
       <w:tr>
         <w:tc>
           <w:tcPr>
-            <w:tcW w:w="1388" w:type="pct"/>
+            <w:tcW w:w="1421" w:type="pct"/>
             <w:tcMar>
               <w:top w:w="30" w:type="dxa"/>
               <w:left w:w="50" w:type="dxa"/>
@@ -678,19 +587,17 @@
             <w:pPr>
               <w:jc w:val="center"/>
             </w:pPr>
-            <w:proofErr w:type="spellStart"/>
             <w:r>
               <w:rPr>
                 <w:b/>
               </w:rPr>
               <w:t>Přístroj</w:t>
             </w:r>
-            <w:proofErr w:type="spellEnd"/>
           </w:p>
         </w:tc>
         <w:tc>
           <w:tcPr>
-            <w:tcW w:w="549" w:type="pct"/>
+            <w:tcW w:w="562" w:type="pct"/>
             <w:tcMar>
               <w:top w:w="30" w:type="dxa"/>
               <w:left w:w="50" w:type="dxa"/>
@@ -713,7 +620,7 @@
         </w:tc>
         <w:tc>
           <w:tcPr>
-            <w:tcW w:w="473" w:type="pct"/>
+            <w:tcW w:w="484" w:type="pct"/>
             <w:tcMar>
               <w:top w:w="30" w:type="dxa"/>
               <w:left w:w="50" w:type="dxa"/>
@@ -736,7 +643,7 @@
         </w:tc>
         <w:tc>
           <w:tcPr>
-            <w:tcW w:w="711" w:type="pct"/>
+            <w:tcW w:w="728" w:type="pct"/>
             <w:tcMar>
               <w:top w:w="30" w:type="dxa"/>
               <w:left w:w="50" w:type="dxa"/>
@@ -759,7 +666,7 @@
         </w:tc>
         <w:tc>
           <w:tcPr>
-            <w:tcW w:w="1879" w:type="pct"/>
+            <w:tcW w:w="1804" w:type="pct"/>
             <w:tcMar>
               <w:top w:w="30" w:type="dxa"/>
               <w:left w:w="50" w:type="dxa"/>
@@ -784,7 +691,7 @@
       <w:tr>
         <w:tc>
           <w:tcPr>
-            <w:tcW w:w="1388" w:type="pct"/>
+            <w:tcW w:w="1421" w:type="pct"/>
             <w:tcMar>
               <w:top w:w="20" w:type="dxa"/>
               <w:left w:w="40" w:type="dxa"/>
@@ -812,7 +719,7 @@
         </w:tc>
         <w:tc>
           <w:tcPr>
-            <w:tcW w:w="549" w:type="pct"/>
+            <w:tcW w:w="562" w:type="pct"/>
             <w:tcMar>
               <w:top w:w="20" w:type="dxa"/>
               <w:left w:w="40" w:type="dxa"/>
@@ -826,13 +733,24 @@
               <w:jc w:val="center"/>
             </w:pPr>
             <w:r>
-              <w:t>{{mereni}}</w:t>
+              <w:t>{{mereni</w:t>
+            </w:r>
+            <w:proofErr w:type="gramStart"/>
+            <w:r>
+              <w:t>}}</w:t>
+            </w:r>
+            <w:r>
+              <w:t xml:space="preserve">   </w:t>
+            </w:r>
+            <w:proofErr w:type="gramEnd"/>
+            <w:r>
+              <w:t xml:space="preserve">                             </w:t>
             </w:r>
           </w:p>
         </w:tc>
         <w:tc>
           <w:tcPr>
-            <w:tcW w:w="473" w:type="pct"/>
+            <w:tcW w:w="484" w:type="pct"/>
             <w:tcMar>
               <w:top w:w="20" w:type="dxa"/>
               <w:left w:w="40" w:type="dxa"/>
@@ -852,7 +770,7 @@
         </w:tc>
         <w:tc>
           <w:tcPr>
-            <w:tcW w:w="711" w:type="pct"/>
+            <w:tcW w:w="728" w:type="pct"/>
             <w:tcMar>
               <w:top w:w="20" w:type="dxa"/>
               <w:left w:w="40" w:type="dxa"/>
@@ -872,7 +790,7 @@
         </w:tc>
         <w:tc>
           <w:tcPr>
-            <w:tcW w:w="1879" w:type="pct"/>
+            <w:tcW w:w="1804" w:type="pct"/>
             <w:tcMar>
               <w:top w:w="20" w:type="dxa"/>
               <w:left w:w="40" w:type="dxa"/>
@@ -886,31 +804,15 @@
               <w:jc w:val="center"/>
             </w:pPr>
             <w:r>
-              <w:t>{{</w:t>
+              <w:t>{{platnost_kalibrace</w:t>
             </w:r>
-            <w:proofErr w:type="spellStart"/>
-            <w:r>
-              <w:t>platnost_kalibrace</w:t>
-            </w:r>
-            <w:proofErr w:type="spellEnd"/>
             <w:proofErr w:type="gramStart"/>
             <w:r>
-              <w:t>}}</w:t>
-            </w:r>
-            <w:r>
-              <w:t>{</w:t>
+              <w:t>}}{</w:t>
             </w:r>
             <w:proofErr w:type="gramEnd"/>
             <w:r>
-              <w:t>{/</w:t>
-            </w:r>
-            <w:proofErr w:type="spellStart"/>
-            <w:r>
-              <w:t>merici_pristroje</w:t>
-            </w:r>
-            <w:proofErr w:type="spellEnd"/>
-            <w:r>
-              <w:t>}}</w:t>
+              <w:t>{/merici_pristroje}}</w:t>
             </w:r>
           </w:p>
         </w:tc>
@@ -956,72 +858,15 @@
           <w:sz w:val="28"/>
           <w:szCs w:val="32"/>
         </w:rPr>
-        <w:t>{{</w:t>
-      </w:r>
-      <w:proofErr w:type="spellStart"/>
-      <w:r>
-        <w:rPr>
-          <w:b/>
-          <w:bCs/>
-          <w:sz w:val="28"/>
-          <w:szCs w:val="32"/>
-        </w:rPr>
-        <w:t>zaver_bezpecnost</w:t>
-      </w:r>
-      <w:proofErr w:type="spellEnd"/>
-      <w:r>
-        <w:rPr>
-          <w:b/>
-          <w:bCs/>
-          <w:sz w:val="28"/>
-          <w:szCs w:val="32"/>
-        </w:rPr>
-        <w:t>}}</w:t>
+        <w:t>{{zaver_bezpecnost}}</w:t>
       </w:r>
     </w:p>
     <w:p>
       <w:pPr>
         <w:jc w:val="center"/>
       </w:pPr>
-      <w:proofErr w:type="spellStart"/>
       <w:r>
-        <w:t>Doporučený</w:t>
-      </w:r>
-      <w:proofErr w:type="spellEnd"/>
-      <w:r>
-        <w:t xml:space="preserve"> </w:t>
-      </w:r>
-      <w:proofErr w:type="spellStart"/>
-      <w:r>
-        <w:t>termín</w:t>
-      </w:r>
-      <w:proofErr w:type="spellEnd"/>
-      <w:r>
-        <w:t xml:space="preserve"> </w:t>
-      </w:r>
-      <w:proofErr w:type="spellStart"/>
-      <w:r>
-        <w:t>příští</w:t>
-      </w:r>
-      <w:proofErr w:type="spellEnd"/>
-      <w:r>
-        <w:t xml:space="preserve"> </w:t>
-      </w:r>
-      <w:proofErr w:type="spellStart"/>
-      <w:r>
-        <w:t>revize</w:t>
-      </w:r>
-      <w:proofErr w:type="spellEnd"/>
-      <w:r>
-        <w:t>: {{</w:t>
-      </w:r>
-      <w:proofErr w:type="spellStart"/>
-      <w:r>
-        <w:t>pristi_revize</w:t>
-      </w:r>
-      <w:proofErr w:type="spellEnd"/>
-      <w:r>
-        <w:t>}}</w:t>
+        <w:t>Doporučený termín příští revize: {{pristi_revize}}</w:t>
       </w:r>
     </w:p>
     <w:p/>
@@ -1035,79 +880,30 @@
       </w:r>
     </w:p>
     <w:p>
-      <w:proofErr w:type="spellStart"/>
       <w:r>
-        <w:t>Výtisk</w:t>
-      </w:r>
-      <w:proofErr w:type="spellEnd"/>
-      <w:r>
-        <w:t xml:space="preserve"> 1: </w:t>
-      </w:r>
-      <w:proofErr w:type="spellStart"/>
-      <w:r>
-        <w:t>Objednatel</w:t>
-      </w:r>
-      <w:proofErr w:type="spellEnd"/>
-    </w:p>
-    <w:p>
-      <w:proofErr w:type="spellStart"/>
-      <w:r>
-        <w:t>Výtisk</w:t>
-      </w:r>
-      <w:proofErr w:type="spellEnd"/>
-      <w:r>
-        <w:t xml:space="preserve"> 2: </w:t>
-      </w:r>
-      <w:proofErr w:type="spellStart"/>
-      <w:r>
-        <w:t>Revizní</w:t>
-      </w:r>
-      <w:proofErr w:type="spellEnd"/>
-      <w:r>
-        <w:t xml:space="preserve"> Technik</w:t>
+        <w:t>Výtisk 1: Objednatel</w:t>
       </w:r>
     </w:p>
     <w:p>
-      <w:proofErr w:type="spellStart"/>
       <w:r>
-        <w:t>Výtisk</w:t>
-      </w:r>
-      <w:proofErr w:type="spellEnd"/>
-      <w:r>
-        <w:t>:     ………………………</w:t>
+        <w:t>Výtisk 2: Revizní Technik</w:t>
       </w:r>
     </w:p>
     <w:p>
-      <w:proofErr w:type="spellStart"/>
       <w:r>
-        <w:t>Výtisk</w:t>
+        <w:t>Výtisk:     ………………………</w:t>
       </w:r>
-      <w:proofErr w:type="spellEnd"/>
+    </w:p>
+    <w:p>
       <w:r>
-        <w:t>:     ………………………</w:t>
+        <w:t>Výtisk:     ………………………</w:t>
       </w:r>
     </w:p>
     <w:p/>
     <w:p/>
     <w:p>
       <w:r>
-        <w:t xml:space="preserve">V _____________, </w:t>
-      </w:r>
-      <w:proofErr w:type="spellStart"/>
-      <w:r>
-        <w:t>dne</w:t>
-      </w:r>
-      <w:proofErr w:type="spellEnd"/>
-      <w:r>
-        <w:t xml:space="preserve"> {{</w:t>
-      </w:r>
-      <w:proofErr w:type="spellStart"/>
-      <w:r>
-        <w:t>datum_vyhotoveni</w:t>
-      </w:r>
-      <w:proofErr w:type="spellEnd"/>
-      <w:r>
-        <w:t>}}</w:t>
+        <w:t>V _____________, dne {{datum_vyhotoveni}}</w:t>
       </w:r>
     </w:p>
     <w:tbl>
@@ -1202,21 +998,8 @@
       <w:pPr>
         <w:jc w:val="center"/>
       </w:pPr>
-      <w:proofErr w:type="spellStart"/>
       <w:r>
-        <w:t>Podpis</w:t>
-      </w:r>
-      <w:proofErr w:type="spellEnd"/>
-      <w:r>
-        <w:t xml:space="preserve"> </w:t>
-      </w:r>
-      <w:proofErr w:type="spellStart"/>
-      <w:r>
-        <w:t>objednatele</w:t>
-      </w:r>
-      <w:proofErr w:type="spellEnd"/>
-      <w:r>
-        <w:t>: ___________________</w:t>
+        <w:t>Podpis objednatele: ___________________</w:t>
       </w:r>
       <w:proofErr w:type="gramStart"/>
       <w:r>
@@ -1230,47 +1013,21 @@
         <w:tab/>
       </w:r>
       <w:r>
-        <w:t xml:space="preserve">      </w:t>
-      </w:r>
-      <w:proofErr w:type="spellStart"/>
-      <w:r>
-        <w:t>Podpis</w:t>
-      </w:r>
-      <w:proofErr w:type="spellEnd"/>
-      <w:r>
-        <w:t xml:space="preserve"> revizního technika: ____________________</w:t>
+        <w:t xml:space="preserve">      Podpis revizního technika: ____________________</w:t>
       </w:r>
     </w:p>
     <w:p>
       <w:r>
         <w:br w:type="page"/>
       </w:r>
-      <w:proofErr w:type="spellStart"/>
       <w:r>
         <w:rPr>
           <w:b/>
           <w:sz w:val="26"/>
         </w:rPr>
         <w:lastRenderedPageBreak/>
-        <w:t>Technická</w:t>
+        <w:t>Technická část</w:t>
       </w:r>
-      <w:proofErr w:type="spellEnd"/>
-      <w:r>
-        <w:rPr>
-          <w:b/>
-          <w:sz w:val="26"/>
-        </w:rPr>
-        <w:t xml:space="preserve"> </w:t>
-      </w:r>
-      <w:proofErr w:type="spellStart"/>
-      <w:r>
-        <w:rPr>
-          <w:b/>
-          <w:sz w:val="26"/>
-        </w:rPr>
-        <w:t>část</w:t>
-      </w:r>
-      <w:proofErr w:type="spellEnd"/>
     </w:p>
     <w:p>
       <w:r>
@@ -1453,6 +1210,12 @@
     </w:tbl>
     <w:p/>
     <w:p>
+      <w:pPr>
+        <w:rPr>
+          <w:b/>
+          <w:sz w:val="26"/>
+        </w:rPr>
+      </w:pPr>
       <w:r>
         <w:rPr>
           <w:b/>
@@ -1462,13 +1225,25 @@
       </w:r>
     </w:p>
     <w:p>
+      <w:pPr>
+        <w:jc w:val="both"/>
+      </w:pPr>
+      <w:r>
+        <w:t>{{popis_objektu}}</w:t>
+      </w:r>
+    </w:p>
+    <w:p>
       <w:r>
         <w:t>Soupis provedených úkonů:</w:t>
       </w:r>
     </w:p>
     <w:p>
       <w:pPr>
-        <w:jc w:val="center"/>
+        <w:tabs>
+          <w:tab w:val="left" w:pos="0"/>
+        </w:tabs>
+        <w:ind w:left="3828" w:firstLine="141"/>
+        <w:jc w:val="both"/>
       </w:pPr>
       <w:r>
         <w:t>{{#ukony_prohlidky}}</w:t>
@@ -1476,7 +1251,11 @@
     </w:p>
     <w:p>
       <w:pPr>
-        <w:jc w:val="center"/>
+        <w:tabs>
+          <w:tab w:val="left" w:pos="0"/>
+        </w:tabs>
+        <w:ind w:left="3828" w:firstLine="141"/>
+        <w:jc w:val="both"/>
       </w:pPr>
       <w:r>
         <w:t>• {{text}}</w:t>
@@ -1484,7 +1263,11 @@
     </w:p>
     <w:p>
       <w:pPr>
-        <w:jc w:val="center"/>
+        <w:tabs>
+          <w:tab w:val="left" w:pos="0"/>
+        </w:tabs>
+        <w:ind w:left="3828" w:firstLine="141"/>
+        <w:jc w:val="both"/>
       </w:pPr>
       <w:r>
         <w:t>{{/ukony_prohlidky}}</w:t>
@@ -1630,6 +1413,9 @@
         <w:gridCol w:w="2686"/>
       </w:tblGrid>
       <w:tr>
+        <w:trPr>
+          <w:trHeight w:hRule="exact" w:val="284"/>
+        </w:trPr>
         <w:tc>
           <w:tcPr>
             <w:tcW w:w="1620" w:type="dxa"/>
@@ -1642,14 +1428,12 @@
             <w:vAlign w:val="center"/>
           </w:tcPr>
           <w:p>
-            <w:proofErr w:type="spellStart"/>
             <w:r>
               <w:rPr>
                 <w:b/>
               </w:rPr>
               <w:t>Výrobce</w:t>
             </w:r>
-            <w:proofErr w:type="spellEnd"/>
             <w:r>
               <w:rPr>
                 <w:b/>
@@ -1708,6 +1492,9 @@
         </w:tc>
       </w:tr>
       <w:tr>
+        <w:trPr>
+          <w:trHeight w:hRule="exact" w:val="284"/>
+        </w:trPr>
         <w:tc>
           <w:tcPr>
             <w:tcW w:w="1620" w:type="dxa"/>
@@ -1720,14 +1507,12 @@
             <w:vAlign w:val="center"/>
           </w:tcPr>
           <w:p>
-            <w:proofErr w:type="spellStart"/>
             <w:r>
               <w:rPr>
                 <w:b/>
               </w:rPr>
               <w:t>Typ</w:t>
             </w:r>
-            <w:proofErr w:type="spellEnd"/>
             <w:r>
               <w:rPr>
                 <w:b/>
@@ -1759,14 +1544,12 @@
             <w:vAlign w:val="center"/>
           </w:tcPr>
           <w:p>
-            <w:proofErr w:type="spellStart"/>
             <w:r>
               <w:rPr>
                 <w:b/>
               </w:rPr>
               <w:t>Odpor</w:t>
             </w:r>
-            <w:proofErr w:type="spellEnd"/>
             <w:r>
               <w:rPr>
                 <w:b/>
@@ -1785,20 +1568,15 @@
               <w:t>0</w:t>
             </w:r>
             <w:r>
-              <w:t>{{</w:t>
-            </w:r>
-            <w:proofErr w:type="spellStart"/>
-            <w:r>
-              <w:t>odpor</w:t>
-            </w:r>
-            <w:proofErr w:type="spellEnd"/>
-            <w:r>
-              <w:t>}}</w:t>
+              <w:t>{{odpor}}</w:t>
             </w:r>
           </w:p>
         </w:tc>
       </w:tr>
       <w:tr>
+        <w:trPr>
+          <w:trHeight w:hRule="exact" w:val="284"/>
+        </w:trPr>
         <w:tc>
           <w:tcPr>
             <w:tcW w:w="1620" w:type="dxa"/>
@@ -1811,28 +1589,12 @@
             <w:vAlign w:val="center"/>
           </w:tcPr>
           <w:p>
-            <w:proofErr w:type="spellStart"/>
             <w:r>
               <w:rPr>
                 <w:b/>
               </w:rPr>
-              <w:t>Výrobní</w:t>
+              <w:t>Výrobní číslo</w:t>
             </w:r>
-            <w:proofErr w:type="spellEnd"/>
-            <w:r>
-              <w:rPr>
-                <w:b/>
-              </w:rPr>
-              <w:t xml:space="preserve"> </w:t>
-            </w:r>
-            <w:proofErr w:type="spellStart"/>
-            <w:r>
-              <w:rPr>
-                <w:b/>
-              </w:rPr>
-              <w:t>číslo</w:t>
-            </w:r>
-            <w:proofErr w:type="spellEnd"/>
             <w:r>
               <w:rPr>
                 <w:b/>
@@ -1864,14 +1626,12 @@
             <w:vAlign w:val="center"/>
           </w:tcPr>
           <w:p>
-            <w:proofErr w:type="spellStart"/>
             <w:r>
               <w:rPr>
                 <w:b/>
               </w:rPr>
               <w:t>Umístění</w:t>
             </w:r>
-            <w:proofErr w:type="spellEnd"/>
             <w:r>
               <w:rPr>
                 <w:b/>
@@ -1893,6 +1653,9 @@
         </w:tc>
       </w:tr>
       <w:tr>
+        <w:trPr>
+          <w:trHeight w:hRule="exact" w:val="284"/>
+        </w:trPr>
         <w:tc>
           <w:tcPr>
             <w:tcW w:w="1620" w:type="dxa"/>
@@ -1905,19 +1668,11 @@
             <w:vAlign w:val="center"/>
           </w:tcPr>
           <w:p>
-            <w:proofErr w:type="spellStart"/>
             <w:r>
               <w:rPr>
                 <w:b/>
               </w:rPr>
-              <w:t>Napětí</w:t>
-            </w:r>
-            <w:proofErr w:type="spellEnd"/>
-            <w:r>
-              <w:rPr>
-                <w:b/>
-              </w:rPr>
-              <w:t xml:space="preserve"> / proud</w:t>
+              <w:t>Napětí / proud</w:t>
             </w:r>
             <w:r>
               <w:rPr>
@@ -1958,28 +1713,7 @@
         </w:tc>
       </w:tr>
     </w:tbl>
-    <w:p>
-      <w:pPr>
-        <w:rPr>
-          <w:b/>
-          <w:sz w:val="22"/>
-        </w:rPr>
-      </w:pPr>
-    </w:p>
-    <w:p>
-      <w:pPr>
-        <w:jc w:val="center"/>
-      </w:pPr>
-      <w:proofErr w:type="spellStart"/>
-      <w:r>
-        <w:rPr>
-          <w:b/>
-          <w:sz w:val="22"/>
-        </w:rPr>
-        <w:t>Komponenty</w:t>
-      </w:r>
-      <w:proofErr w:type="spellEnd"/>
-    </w:p>
+    <w:p/>
     <w:tbl>
       <w:tblPr>
         <w:tblW w:w="5000" w:type="pct"/>
@@ -1997,8 +1731,8 @@
         <w:gridCol w:w="2042"/>
         <w:gridCol w:w="725"/>
         <w:gridCol w:w="560"/>
-        <w:gridCol w:w="80"/>
-        <w:gridCol w:w="568"/>
+        <w:gridCol w:w="87"/>
+        <w:gridCol w:w="561"/>
         <w:gridCol w:w="961"/>
         <w:gridCol w:w="595"/>
         <w:gridCol w:w="463"/>
@@ -2009,7 +1743,11 @@
       <w:tr>
         <w:tc>
           <w:tcPr>
-            <w:tcW w:w="997" w:type="pct"/>
+            <w:tcW w:w="991" w:type="pct"/>
+            <w:tcBorders>
+              <w:top w:val="single" w:sz="4" w:space="0" w:color="auto"/>
+              <w:left w:val="single" w:sz="4" w:space="0" w:color="auto"/>
+            </w:tcBorders>
             <w:tcMar>
               <w:top w:w="30" w:type="dxa"/>
               <w:left w:w="50" w:type="dxa"/>
@@ -2022,19 +1760,20 @@
             <w:pPr>
               <w:jc w:val="center"/>
             </w:pPr>
-            <w:proofErr w:type="spellStart"/>
             <w:r>
               <w:rPr>
                 <w:b/>
               </w:rPr>
               <w:t>Název</w:t>
             </w:r>
-            <w:proofErr w:type="spellEnd"/>
           </w:p>
         </w:tc>
         <w:tc>
           <w:tcPr>
-            <w:tcW w:w="351" w:type="pct"/>
+            <w:tcW w:w="352" w:type="pct"/>
+            <w:tcBorders>
+              <w:top w:val="single" w:sz="4" w:space="0" w:color="auto"/>
+            </w:tcBorders>
             <w:tcMar>
               <w:top w:w="30" w:type="dxa"/>
               <w:left w:w="50" w:type="dxa"/>
@@ -2057,8 +1796,11 @@
         </w:tc>
         <w:tc>
           <w:tcPr>
-            <w:tcW w:w="293" w:type="pct"/>
+            <w:tcW w:w="311" w:type="pct"/>
             <w:gridSpan w:val="2"/>
+            <w:tcBorders>
+              <w:top w:val="single" w:sz="4" w:space="0" w:color="auto"/>
+            </w:tcBorders>
             <w:tcMar>
               <w:top w:w="30" w:type="dxa"/>
               <w:left w:w="50" w:type="dxa"/>
@@ -2081,7 +1823,10 @@
         </w:tc>
         <w:tc>
           <w:tcPr>
-            <w:tcW w:w="285" w:type="pct"/>
+            <w:tcW w:w="276" w:type="pct"/>
+            <w:tcBorders>
+              <w:top w:val="single" w:sz="4" w:space="0" w:color="auto"/>
+            </w:tcBorders>
             <w:tcMar>
               <w:top w:w="30" w:type="dxa"/>
               <w:left w:w="50" w:type="dxa"/>
@@ -2105,6 +1850,9 @@
         <w:tc>
           <w:tcPr>
             <w:tcW w:w="467" w:type="pct"/>
+            <w:tcBorders>
+              <w:top w:val="single" w:sz="4" w:space="0" w:color="auto"/>
+            </w:tcBorders>
             <w:tcMar>
               <w:top w:w="30" w:type="dxa"/>
               <w:left w:w="50" w:type="dxa"/>
@@ -2127,7 +1875,10 @@
         </w:tc>
         <w:tc>
           <w:tcPr>
-            <w:tcW w:w="287" w:type="pct"/>
+            <w:tcW w:w="289" w:type="pct"/>
+            <w:tcBorders>
+              <w:top w:val="single" w:sz="4" w:space="0" w:color="auto"/>
+            </w:tcBorders>
             <w:tcMar>
               <w:top w:w="30" w:type="dxa"/>
               <w:left w:w="50" w:type="dxa"/>
@@ -2150,7 +1901,10 @@
         </w:tc>
         <w:tc>
           <w:tcPr>
-            <w:tcW w:w="222" w:type="pct"/>
+            <w:tcW w:w="225" w:type="pct"/>
+            <w:tcBorders>
+              <w:top w:val="single" w:sz="4" w:space="0" w:color="auto"/>
+            </w:tcBorders>
             <w:tcMar>
               <w:top w:w="30" w:type="dxa"/>
               <w:left w:w="50" w:type="dxa"/>
@@ -2173,7 +1927,10 @@
         </w:tc>
         <w:tc>
           <w:tcPr>
-            <w:tcW w:w="422" w:type="pct"/>
+            <w:tcW w:w="423" w:type="pct"/>
+            <w:tcBorders>
+              <w:top w:val="single" w:sz="4" w:space="0" w:color="auto"/>
+            </w:tcBorders>
             <w:tcMar>
               <w:top w:w="30" w:type="dxa"/>
               <w:left w:w="50" w:type="dxa"/>
@@ -2196,7 +1953,10 @@
         </w:tc>
         <w:tc>
           <w:tcPr>
-            <w:tcW w:w="522" w:type="pct"/>
+            <w:tcW w:w="521" w:type="pct"/>
+            <w:tcBorders>
+              <w:top w:val="single" w:sz="4" w:space="0" w:color="auto"/>
+            </w:tcBorders>
             <w:tcMar>
               <w:top w:w="30" w:type="dxa"/>
               <w:left w:w="50" w:type="dxa"/>
@@ -2219,7 +1979,11 @@
         </w:tc>
         <w:tc>
           <w:tcPr>
-            <w:tcW w:w="1155" w:type="pct"/>
+            <w:tcW w:w="1146" w:type="pct"/>
+            <w:tcBorders>
+              <w:top w:val="single" w:sz="4" w:space="0" w:color="auto"/>
+              <w:right w:val="single" w:sz="4" w:space="0" w:color="auto"/>
+            </w:tcBorders>
             <w:tcMar>
               <w:top w:w="30" w:type="dxa"/>
               <w:left w:w="50" w:type="dxa"/>
@@ -2244,7 +2008,11 @@
       <w:tr>
         <w:tc>
           <w:tcPr>
-            <w:tcW w:w="997" w:type="pct"/>
+            <w:tcW w:w="991" w:type="pct"/>
+            <w:tcBorders>
+              <w:left w:val="single" w:sz="4" w:space="0" w:color="auto"/>
+              <w:bottom w:val="single" w:sz="4" w:space="0" w:color="auto"/>
+            </w:tcBorders>
             <w:tcMar>
               <w:top w:w="20" w:type="dxa"/>
               <w:left w:w="40" w:type="dxa"/>
@@ -2272,7 +2040,10 @@
         </w:tc>
         <w:tc>
           <w:tcPr>
-            <w:tcW w:w="351" w:type="pct"/>
+            <w:tcW w:w="352" w:type="pct"/>
+            <w:tcBorders>
+              <w:bottom w:val="single" w:sz="4" w:space="0" w:color="auto"/>
+            </w:tcBorders>
             <w:tcMar>
               <w:top w:w="20" w:type="dxa"/>
               <w:left w:w="40" w:type="dxa"/>
@@ -2292,7 +2063,10 @@
         </w:tc>
         <w:tc>
           <w:tcPr>
-            <w:tcW w:w="270" w:type="pct"/>
+            <w:tcW w:w="272" w:type="pct"/>
+            <w:tcBorders>
+              <w:bottom w:val="single" w:sz="4" w:space="0" w:color="auto"/>
+            </w:tcBorders>
             <w:tcMar>
               <w:top w:w="20" w:type="dxa"/>
               <w:left w:w="40" w:type="dxa"/>
@@ -2312,8 +2086,11 @@
         </w:tc>
         <w:tc>
           <w:tcPr>
-            <w:tcW w:w="308" w:type="pct"/>
+            <w:tcW w:w="315" w:type="pct"/>
             <w:gridSpan w:val="2"/>
+            <w:tcBorders>
+              <w:bottom w:val="single" w:sz="4" w:space="0" w:color="auto"/>
+            </w:tcBorders>
             <w:tcMar>
               <w:top w:w="20" w:type="dxa"/>
               <w:left w:w="40" w:type="dxa"/>
@@ -2334,6 +2111,9 @@
         <w:tc>
           <w:tcPr>
             <w:tcW w:w="467" w:type="pct"/>
+            <w:tcBorders>
+              <w:bottom w:val="single" w:sz="4" w:space="0" w:color="auto"/>
+            </w:tcBorders>
             <w:tcMar>
               <w:top w:w="20" w:type="dxa"/>
               <w:left w:w="40" w:type="dxa"/>
@@ -2353,7 +2133,10 @@
         </w:tc>
         <w:tc>
           <w:tcPr>
-            <w:tcW w:w="287" w:type="pct"/>
+            <w:tcW w:w="289" w:type="pct"/>
+            <w:tcBorders>
+              <w:bottom w:val="single" w:sz="4" w:space="0" w:color="auto"/>
+            </w:tcBorders>
             <w:tcMar>
               <w:top w:w="20" w:type="dxa"/>
               <w:left w:w="40" w:type="dxa"/>
@@ -2373,7 +2156,10 @@
         </w:tc>
         <w:tc>
           <w:tcPr>
-            <w:tcW w:w="222" w:type="pct"/>
+            <w:tcW w:w="225" w:type="pct"/>
+            <w:tcBorders>
+              <w:bottom w:val="single" w:sz="4" w:space="0" w:color="auto"/>
+            </w:tcBorders>
             <w:tcMar>
               <w:top w:w="20" w:type="dxa"/>
               <w:left w:w="40" w:type="dxa"/>
@@ -2393,7 +2179,10 @@
         </w:tc>
         <w:tc>
           <w:tcPr>
-            <w:tcW w:w="422" w:type="pct"/>
+            <w:tcW w:w="423" w:type="pct"/>
+            <w:tcBorders>
+              <w:bottom w:val="single" w:sz="4" w:space="0" w:color="auto"/>
+            </w:tcBorders>
             <w:tcMar>
               <w:top w:w="20" w:type="dxa"/>
               <w:left w:w="40" w:type="dxa"/>
@@ -2413,7 +2202,10 @@
         </w:tc>
         <w:tc>
           <w:tcPr>
-            <w:tcW w:w="522" w:type="pct"/>
+            <w:tcW w:w="521" w:type="pct"/>
+            <w:tcBorders>
+              <w:bottom w:val="single" w:sz="4" w:space="0" w:color="auto"/>
+            </w:tcBorders>
             <w:tcMar>
               <w:top w:w="20" w:type="dxa"/>
               <w:left w:w="40" w:type="dxa"/>
@@ -2433,7 +2225,11 @@
         </w:tc>
         <w:tc>
           <w:tcPr>
-            <w:tcW w:w="1155" w:type="pct"/>
+            <w:tcW w:w="1146" w:type="pct"/>
+            <w:tcBorders>
+              <w:bottom w:val="single" w:sz="4" w:space="0" w:color="auto"/>
+              <w:right w:val="single" w:sz="4" w:space="0" w:color="auto"/>
+            </w:tcBorders>
             <w:tcMar>
               <w:top w:w="20" w:type="dxa"/>
               <w:left w:w="40" w:type="dxa"/>
@@ -2462,16 +2258,17 @@
       </w:tr>
     </w:tbl>
     <w:p>
+      <w:pPr>
+        <w:jc w:val="center"/>
+      </w:pPr>
       <w:r>
-        <w:t>{{/</w:t>
+        <w:t>{{poznamky_text}}</w:t>
       </w:r>
-      <w:proofErr w:type="spellStart"/>
+    </w:p>
+    <w:p/>
+    <w:p>
       <w:r>
-        <w:t>rozvadece</w:t>
-      </w:r>
-      <w:proofErr w:type="spellEnd"/>
-      <w:r>
-        <w:t>}}</w:t>
+        <w:t>{{/rozvadece}}</w:t>
       </w:r>
     </w:p>
     <w:p/>
@@ -2482,12 +2279,12 @@
           <w:b/>
           <w:sz w:val="23"/>
         </w:rPr>
+        <w:lastRenderedPageBreak/>
         <w:t>Místnosti</w:t>
       </w:r>
     </w:p>
     <w:p>
       <w:r>
-        <w:lastRenderedPageBreak/>
         <w:t>{{#mistnosti}}</w:t>
       </w:r>
     </w:p>
@@ -2527,9 +2324,16 @@
         <w:gridCol w:w="2590"/>
       </w:tblGrid>
       <w:tr>
+        <w:trPr>
+          <w:trHeight w:hRule="exact" w:val="284"/>
+        </w:trPr>
         <w:tc>
           <w:tcPr>
             <w:tcW w:w="1814" w:type="dxa"/>
+            <w:tcBorders>
+              <w:top w:val="single" w:sz="4" w:space="0" w:color="auto"/>
+              <w:left w:val="single" w:sz="4" w:space="0" w:color="auto"/>
+            </w:tcBorders>
             <w:tcMar>
               <w:top w:w="30" w:type="dxa"/>
               <w:left w:w="50" w:type="dxa"/>
@@ -2549,6 +2353,9 @@
         <w:tc>
           <w:tcPr>
             <w:tcW w:w="907" w:type="dxa"/>
+            <w:tcBorders>
+              <w:top w:val="single" w:sz="4" w:space="0" w:color="auto"/>
+            </w:tcBorders>
             <w:tcMar>
               <w:top w:w="30" w:type="dxa"/>
               <w:left w:w="50" w:type="dxa"/>
@@ -2568,6 +2375,9 @@
         <w:tc>
           <w:tcPr>
             <w:tcW w:w="1361" w:type="dxa"/>
+            <w:tcBorders>
+              <w:top w:val="single" w:sz="4" w:space="0" w:color="auto"/>
+            </w:tcBorders>
             <w:tcMar>
               <w:top w:w="30" w:type="dxa"/>
               <w:left w:w="50" w:type="dxa"/>
@@ -2587,6 +2397,9 @@
         <w:tc>
           <w:tcPr>
             <w:tcW w:w="1020" w:type="dxa"/>
+            <w:tcBorders>
+              <w:top w:val="single" w:sz="4" w:space="0" w:color="auto"/>
+            </w:tcBorders>
             <w:tcMar>
               <w:top w:w="30" w:type="dxa"/>
               <w:left w:w="50" w:type="dxa"/>
@@ -2606,6 +2419,9 @@
         <w:tc>
           <w:tcPr>
             <w:tcW w:w="1474" w:type="dxa"/>
+            <w:tcBorders>
+              <w:top w:val="single" w:sz="4" w:space="0" w:color="auto"/>
+            </w:tcBorders>
             <w:tcMar>
               <w:top w:w="30" w:type="dxa"/>
               <w:left w:w="50" w:type="dxa"/>
@@ -2625,6 +2441,10 @@
         <w:tc>
           <w:tcPr>
             <w:tcW w:w="2721" w:type="dxa"/>
+            <w:tcBorders>
+              <w:top w:val="single" w:sz="4" w:space="0" w:color="auto"/>
+              <w:right w:val="single" w:sz="4" w:space="0" w:color="auto"/>
+            </w:tcBorders>
             <w:tcMar>
               <w:top w:w="30" w:type="dxa"/>
               <w:left w:w="50" w:type="dxa"/>
@@ -2643,9 +2463,16 @@
         </w:tc>
       </w:tr>
       <w:tr>
+        <w:trPr>
+          <w:trHeight w:hRule="exact" w:val="284"/>
+        </w:trPr>
         <w:tc>
           <w:tcPr>
             <w:tcW w:w="1700" w:type="dxa"/>
+            <w:tcBorders>
+              <w:left w:val="single" w:sz="4" w:space="0" w:color="auto"/>
+              <w:bottom w:val="single" w:sz="4" w:space="0" w:color="auto"/>
+            </w:tcBorders>
             <w:tcMar>
               <w:top w:w="20" w:type="dxa"/>
               <w:left w:w="40" w:type="dxa"/>
@@ -2671,6 +2498,9 @@
         <w:tc>
           <w:tcPr>
             <w:tcW w:w="1700" w:type="dxa"/>
+            <w:tcBorders>
+              <w:bottom w:val="single" w:sz="4" w:space="0" w:color="auto"/>
+            </w:tcBorders>
             <w:tcMar>
               <w:top w:w="20" w:type="dxa"/>
               <w:left w:w="40" w:type="dxa"/>
@@ -2688,6 +2518,9 @@
         <w:tc>
           <w:tcPr>
             <w:tcW w:w="1700" w:type="dxa"/>
+            <w:tcBorders>
+              <w:bottom w:val="single" w:sz="4" w:space="0" w:color="auto"/>
+            </w:tcBorders>
             <w:tcMar>
               <w:top w:w="20" w:type="dxa"/>
               <w:left w:w="40" w:type="dxa"/>
@@ -2705,6 +2538,9 @@
         <w:tc>
           <w:tcPr>
             <w:tcW w:w="1700" w:type="dxa"/>
+            <w:tcBorders>
+              <w:bottom w:val="single" w:sz="4" w:space="0" w:color="auto"/>
+            </w:tcBorders>
             <w:tcMar>
               <w:top w:w="20" w:type="dxa"/>
               <w:left w:w="40" w:type="dxa"/>
@@ -2722,6 +2558,9 @@
         <w:tc>
           <w:tcPr>
             <w:tcW w:w="1700" w:type="dxa"/>
+            <w:tcBorders>
+              <w:bottom w:val="single" w:sz="4" w:space="0" w:color="auto"/>
+            </w:tcBorders>
             <w:tcMar>
               <w:top w:w="20" w:type="dxa"/>
               <w:left w:w="40" w:type="dxa"/>
@@ -2739,6 +2578,10 @@
         <w:tc>
           <w:tcPr>
             <w:tcW w:w="1700" w:type="dxa"/>
+            <w:tcBorders>
+              <w:bottom w:val="single" w:sz="4" w:space="0" w:color="auto"/>
+              <w:right w:val="single" w:sz="4" w:space="0" w:color="auto"/>
+            </w:tcBorders>
             <w:tcMar>
               <w:top w:w="20" w:type="dxa"/>
               <w:left w:w="40" w:type="dxa"/>
@@ -2763,6 +2606,8 @@
         </w:tc>
       </w:tr>
     </w:tbl>
+    <w:p/>
+    <w:p/>
     <w:p>
       <w:r>
         <w:t>{{/mistnosti}}</w:t>
@@ -2797,9 +2642,16 @@
         <w:gridCol w:w="2971"/>
       </w:tblGrid>
       <w:tr>
+        <w:trPr>
+          <w:trHeight w:val="284"/>
+        </w:trPr>
         <w:tc>
           <w:tcPr>
             <w:tcW w:w="5669" w:type="dxa"/>
+            <w:tcBorders>
+              <w:top w:val="single" w:sz="4" w:space="0" w:color="auto"/>
+              <w:left w:val="single" w:sz="4" w:space="0" w:color="auto"/>
+            </w:tcBorders>
             <w:tcMar>
               <w:top w:w="30" w:type="dxa"/>
               <w:left w:w="50" w:type="dxa"/>
@@ -2819,6 +2671,9 @@
         <w:tc>
           <w:tcPr>
             <w:tcW w:w="2268" w:type="dxa"/>
+            <w:tcBorders>
+              <w:top w:val="single" w:sz="4" w:space="0" w:color="auto"/>
+            </w:tcBorders>
             <w:tcMar>
               <w:top w:w="30" w:type="dxa"/>
               <w:left w:w="50" w:type="dxa"/>
@@ -2838,6 +2693,10 @@
         <w:tc>
           <w:tcPr>
             <w:tcW w:w="1417" w:type="dxa"/>
+            <w:tcBorders>
+              <w:top w:val="single" w:sz="4" w:space="0" w:color="auto"/>
+              <w:right w:val="single" w:sz="4" w:space="0" w:color="auto"/>
+            </w:tcBorders>
             <w:tcMar>
               <w:top w:w="30" w:type="dxa"/>
               <w:left w:w="50" w:type="dxa"/>
@@ -2856,9 +2715,16 @@
         </w:tc>
       </w:tr>
       <w:tr>
+        <w:trPr>
+          <w:trHeight w:val="284"/>
+        </w:trPr>
         <w:tc>
           <w:tcPr>
             <w:tcW w:w="3400" w:type="dxa"/>
+            <w:tcBorders>
+              <w:left w:val="single" w:sz="4" w:space="0" w:color="auto"/>
+              <w:bottom w:val="single" w:sz="4" w:space="0" w:color="auto"/>
+            </w:tcBorders>
             <w:tcMar>
               <w:top w:w="20" w:type="dxa"/>
               <w:left w:w="40" w:type="dxa"/>
@@ -2884,6 +2750,9 @@
         <w:tc>
           <w:tcPr>
             <w:tcW w:w="3400" w:type="dxa"/>
+            <w:tcBorders>
+              <w:bottom w:val="single" w:sz="4" w:space="0" w:color="auto"/>
+            </w:tcBorders>
             <w:tcMar>
               <w:top w:w="20" w:type="dxa"/>
               <w:left w:w="40" w:type="dxa"/>
@@ -2901,6 +2770,10 @@
         <w:tc>
           <w:tcPr>
             <w:tcW w:w="3400" w:type="dxa"/>
+            <w:tcBorders>
+              <w:bottom w:val="single" w:sz="4" w:space="0" w:color="auto"/>
+              <w:right w:val="single" w:sz="4" w:space="0" w:color="auto"/>
+            </w:tcBorders>
             <w:tcMar>
               <w:top w:w="20" w:type="dxa"/>
               <w:left w:w="40" w:type="dxa"/>
@@ -2925,6 +2798,7 @@
         </w:tc>
       </w:tr>
     </w:tbl>
+    <w:p/>
     <w:p/>
     <w:p>
       <w:r>
@@ -2958,27 +2832,7 @@
           <w:sz w:val="24"/>
           <w:szCs w:val="28"/>
         </w:rPr>
-        <w:t>{{</w:t>
-      </w:r>
-      <w:proofErr w:type="spellStart"/>
-      <w:r>
-        <w:rPr>
-          <w:b/>
-          <w:bCs/>
-          <w:sz w:val="24"/>
-          <w:szCs w:val="28"/>
-        </w:rPr>
-        <w:t>zaver_bezpecnost</w:t>
-      </w:r>
-      <w:proofErr w:type="spellEnd"/>
-      <w:r>
-        <w:rPr>
-          <w:b/>
-          <w:bCs/>
-          <w:sz w:val="24"/>
-          <w:szCs w:val="28"/>
-        </w:rPr>
-        <w:t>}}</w:t>
+        <w:t>{{zaver_bezpecnost}}</w:t>
       </w:r>
     </w:p>
     <w:p>
@@ -3114,8 +2968,7 @@
     <w:tblGrid>
       <w:gridCol w:w="1475"/>
       <w:gridCol w:w="2651"/>
-      <w:gridCol w:w="612"/>
-      <w:gridCol w:w="2304"/>
+      <w:gridCol w:w="2916"/>
       <w:gridCol w:w="3278"/>
       <w:gridCol w:w="362"/>
     </w:tblGrid>
@@ -3132,28 +2985,12 @@
           <w:vAlign w:val="center"/>
         </w:tcPr>
         <w:p>
-          <w:proofErr w:type="spellStart"/>
           <w:r>
             <w:rPr>
               <w:b/>
             </w:rPr>
-            <w:t>Evidenční</w:t>
+            <w:t>Evidenční číslo</w:t>
           </w:r>
-          <w:proofErr w:type="spellEnd"/>
-          <w:r>
-            <w:rPr>
-              <w:b/>
-            </w:rPr>
-            <w:t xml:space="preserve"> </w:t>
-          </w:r>
-          <w:proofErr w:type="spellStart"/>
-          <w:r>
-            <w:rPr>
-              <w:b/>
-            </w:rPr>
-            <w:t>číslo</w:t>
-          </w:r>
-          <w:proofErr w:type="spellEnd"/>
         </w:p>
       </w:tc>
       <w:tc>
@@ -3162,21 +2999,14 @@
         </w:tcPr>
         <w:p>
           <w:r>
-            <w:t>{{</w:t>
-          </w:r>
-          <w:proofErr w:type="spellStart"/>
-          <w:r>
-            <w:t>evidencni</w:t>
-          </w:r>
-          <w:proofErr w:type="spellEnd"/>
-          <w:r>
-            <w:t>}}</w:t>
+            <w:t>{{evidencni}}</w:t>
           </w:r>
         </w:p>
       </w:tc>
       <w:tc>
         <w:tcPr>
-          <w:tcW w:w="612" w:type="dxa"/>
+          <w:tcW w:w="6556" w:type="dxa"/>
+          <w:gridSpan w:val="3"/>
           <w:tcMar>
             <w:top w:w="40" w:type="dxa"/>
             <w:left w:w="60" w:type="dxa"/>
@@ -3186,34 +3016,17 @@
           <w:vAlign w:val="center"/>
         </w:tcPr>
         <w:p>
+          <w:pPr>
+            <w:jc w:val="right"/>
+          </w:pPr>
           <w:r>
             <w:rPr>
               <w:b/>
             </w:rPr>
             <w:t>UUID</w:t>
           </w:r>
-        </w:p>
-      </w:tc>
-      <w:tc>
-        <w:tcPr>
-          <w:tcW w:w="5944" w:type="dxa"/>
-          <w:gridSpan w:val="3"/>
-          <w:vAlign w:val="center"/>
-        </w:tcPr>
-        <w:p>
-          <w:pPr>
-            <w:spacing w:after="200" w:line="276" w:lineRule="auto"/>
-          </w:pPr>
           <w:r>
-            <w:t>{{</w:t>
-          </w:r>
-          <w:proofErr w:type="spellStart"/>
-          <w:r>
-            <w:t>uuid</w:t>
-          </w:r>
-          <w:proofErr w:type="spellEnd"/>
-          <w:r>
-            <w:t>}}</w:t>
+            <w:t>{{uuid}}</w:t>
           </w:r>
         </w:p>
       </w:tc>
@@ -3245,7 +3058,6 @@
       <w:tc>
         <w:tcPr>
           <w:tcW w:w="2916" w:type="dxa"/>
-          <w:gridSpan w:val="2"/>
         </w:tcPr>
         <w:p/>
       </w:tc>
@@ -4085,7 +3897,6 @@
   <w:style w:type="character" w:default="1" w:styleId="Standardnpsmoodstavce">
     <w:name w:val="Default Paragraph Font"/>
     <w:uiPriority w:val="1"/>
-    <w:semiHidden/>
     <w:unhideWhenUsed/>
   </w:style>
   <w:style w:type="table" w:default="1" w:styleId="Normlntabulka">

</xml_diff>